<commit_message>
Clean duplicate revised biography source files
</commit_message>
<xml_diff>
--- a/content/Bios/Art_Wollenweber.docx
+++ b/content/Bios/Art_Wollenweber.docx
@@ -1,134 +1,8 @@
 
 <file path=word/document.xml><?xml version="1.0" encoding="utf-8"?>
-<w:document xmlns:w14="http://schemas.microsoft.com/office/word/2010/wordml" xmlns:wp14="http://schemas.microsoft.com/office/word/2010/wordprocessingDrawing" xmlns:w="http://schemas.openxmlformats.org/wordprocessingml/2006/main" xmlns:m="http://schemas.openxmlformats.org/officeDocument/2006/math" xmlns:r="http://schemas.openxmlformats.org/officeDocument/2006/relationships" xmlns:o="urn:schemas-microsoft-com:office:office" xmlns:v="urn:schemas-microsoft-com:vml" xmlns:w10="urn:schemas-microsoft-com:office:word" xmlns:a="http://schemas.openxmlformats.org/drawingml/2006/main" xmlns:pic="http://schemas.openxmlformats.org/drawingml/2006/picture" xmlns:wp="http://schemas.openxmlformats.org/drawingml/2006/wordprocessingDrawing" xmlns:mc="http://schemas.openxmlformats.org/markup-compatibility/2006" mc:Ignorable="w14 wp14">
+<w:document xmlns:ns1="http://schemas.openxmlformats.org/markup-compatibility/2006" xmlns:ns2="http://schemas.microsoft.com/office/word/2010/wordml" xmlns:w="http://schemas.openxmlformats.org/wordprocessingml/2006/main" ns1:Ignorable="w14 wp14">
   <w:body>
-    <w:p xmlns:wp14="http://schemas.microsoft.com/office/word/2010/wordml" wp14:textId="77777777">
-      <w:pPr>
-        <w:pStyle w:val="FirstParagraph"/>
-      </w:pPr>
-      <w:r>
-        <w:rPr/>
-        <w:t>1992 Hall of Fame Inductee Art Wollenweber – Sheridan</w:t>
-      </w:r>
-      <w:r>
-        <w:rPr/>
-        <w:t xml:space="preserve"> </w:t>
-      </w:r>
-      <w:r>
-        <w:rPr/>
-        <w:t xml:space="preserve">Art Wollenweber was named the Colorado High School Coaches Association Coach of the Year in </w:t>
-      </w:r>
-      <w:r>
-        <w:rPr/>
-        <w:t>1987,</w:t>
-      </w:r>
-      <w:r>
-        <w:rPr/>
-        <w:t xml:space="preserve"> </w:t>
-      </w:r>
-      <w:r>
-        <w:rPr/>
-        <w:t>the former Sheridan High School coach achieved plenty.</w:t>
-      </w:r>
-      <w:r>
-        <w:rPr/>
-        <w:t xml:space="preserve"> </w:t>
-      </w:r>
-      <w:r>
-        <w:rPr/>
-        <w:t>Art garnered achievement awards for 250 and 300 victories and in 1979 was named National High</w:t>
-      </w:r>
-      <w:r>
-        <w:rPr/>
-        <w:t xml:space="preserve"> </w:t>
-      </w:r>
-      <w:r>
-        <w:rPr/>
-        <w:t>School Athletic Coaches Association District 6 Coach of the Year and ventured to Florida to claim the</w:t>
-      </w:r>
-      <w:r>
-        <w:rPr/>
-        <w:t xml:space="preserve"> </w:t>
-      </w:r>
-      <w:r>
-        <w:rPr/>
-        <w:t>award.</w:t>
-      </w:r>
-      <w:r>
-        <w:rPr/>
-        <w:t xml:space="preserve"> </w:t>
-      </w:r>
-      <w:r>
-        <w:rPr/>
-        <w:t xml:space="preserve">Art was </w:t>
-      </w:r>
-      <w:r>
-        <w:rPr/>
-        <w:t>presented</w:t>
-      </w:r>
-      <w:r>
-        <w:rPr/>
-        <w:t xml:space="preserve"> the Metro League Hall of Fame award in 1984, earned a national high school coaching</w:t>
-      </w:r>
-      <w:r>
-        <w:rPr/>
-        <w:t xml:space="preserve"> </w:t>
-      </w:r>
-      <w:r>
-        <w:rPr/>
-        <w:t>gold award in 1987, a CHSCA Hall of Fame award in 1989 and was athletic director of the year for the</w:t>
-      </w:r>
-      <w:r>
-        <w:rPr/>
-        <w:t xml:space="preserve"> </w:t>
-      </w:r>
-      <w:r>
-        <w:rPr/>
-        <w:t>1988-89 school year.</w:t>
-      </w:r>
-      <w:r>
-        <w:rPr/>
-        <w:t xml:space="preserve"> </w:t>
-      </w:r>
-      <w:r>
-        <w:rPr/>
-        <w:t>Art played on the 1949 Northern Colorado squad that made it to the NCAA Regional’s before dropping a</w:t>
-      </w:r>
-      <w:r>
-        <w:rPr/>
-        <w:t xml:space="preserve"> </w:t>
-      </w:r>
-      <w:r>
-        <w:rPr/>
-        <w:t>three-game series to Southern California.</w:t>
-      </w:r>
-      <w:r>
-        <w:rPr/>
-        <w:t xml:space="preserve"> </w:t>
-      </w:r>
-      <w:r>
-        <w:rPr/>
-        <w:t>He was also able to coach his sons while at Sheridan in the 1960’s and 70’s.</w:t>
-      </w:r>
-    </w:p>
-    <w:p>
-      <w:pPr>
-        <w:pStyle w:val="BodyText"/>
-      </w:pPr>
-    </w:p>
-    <w:p>
-      <w:pPr>
-        <w:pStyle w:val="Title"/>
-      </w:pPr>
-      <w:r>
-        <w:rPr>
-          <w:noProof w:val="0"/>
-          <w:lang w:val="en-US"/>
-        </w:rPr>
-        <w:t>Revised Biography: Art Wollenweber</w:t>
-      </w:r>
-    </w:p>
-    <w:p>
+    <w:p ns2:paraId="532A5ED2" ns2:textId="7D1E317E">
       <w:pPr>
         <w:pStyle w:val="Subtitle"/>
         <w:rPr/>
@@ -141,7 +15,7 @@
         <w:t>1992 Hall of Fame Inductee – Sheridan</w:t>
       </w:r>
     </w:p>
-    <w:p>
+    <w:p ns2:paraId="58387BB0" ns2:textId="31D97945">
       <w:pPr>
         <w:spacing w:before="0" w:beforeAutospacing="off" w:after="0" w:afterAutospacing="off" w:line="300" w:lineRule="auto"/>
         <w:rPr>
@@ -227,7 +101,7 @@
         <w:t>, capping an impressive run of competitive success and program leadership.</w:t>
       </w:r>
     </w:p>
-    <w:p>
+    <w:p ns2:paraId="236E3732" ns2:textId="06D61428">
       <w:pPr>
         <w:spacing w:before="0" w:beforeAutospacing="off" w:after="0" w:afterAutospacing="off" w:line="300" w:lineRule="auto"/>
         <w:rPr>
@@ -285,7 +159,7 @@
         <w:t>, a distinction he accepted during ceremonies in Florida.</w:t>
       </w:r>
     </w:p>
-    <w:p>
+    <w:p ns2:paraId="43D7D375" ns2:textId="0CDC99C4">
       <w:pPr>
         <w:spacing w:before="0" w:beforeAutospacing="off" w:after="0" w:afterAutospacing="off" w:line="300" w:lineRule="auto"/>
         <w:rPr>
@@ -371,7 +245,7 @@
         <w:t xml:space="preserve"> inducted him in 1989, and he was named Colorado’s Athletic Director of the Year for the 1988–89 school year.</w:t>
       </w:r>
     </w:p>
-    <w:p>
+    <w:p ns2:paraId="6AF1278E" ns2:textId="4F79C03A">
       <w:pPr>
         <w:spacing w:before="0" w:beforeAutospacing="off" w:after="0" w:afterAutospacing="off" w:line="300" w:lineRule="auto"/>
         <w:rPr>
@@ -429,7 +303,7 @@
         <w:t xml:space="preserve"> baseball team that advanced to the NCAA Regionals, where the squad fell in a three‑game series to Southern California. Among the highlights of his coaching journey was the opportunity to coach his sons during his years at Sheridan in the 1960s and 1970s.</w:t>
       </w:r>
     </w:p>
-    <w:p>
+    <w:p ns2:paraId="35C90EE8" ns2:textId="6325BEFF">
       <w:pPr>
         <w:pStyle w:val="BodyText"/>
       </w:pPr>

</xml_diff>